<commit_message>
AddValueHost takes state as parameter
Ensure that the user can supply state with ValidationManager.AddValueHost in addition to its constructor.
</commit_message>
<xml_diff>
--- a/Jivs ReadMe.docx
+++ b/Jivs ReadMe.docx
@@ -6,76 +6,53 @@
       <w:pPr>
         <w:pStyle w:val="Heading1"/>
       </w:pPr>
+      <w:r>
+        <w:t>Jivs - JavaScript Input Validation Service</w:t>
+      </w:r>
+    </w:p>
+    <w:p>
+      <w:r>
+        <w:t>Back in the day (2002-2013), I created a successful suite of Web Controls for ASP.NET WebForms which featured a complete replacement to its built-in input validation. I really learned a lot about what website developers wanted on</w:t>
+      </w:r>
+      <w:r>
+        <w:t>-</w:t>
+      </w:r>
+      <w:r>
+        <w:t>screen. In the 10+ years that followed, I’ve learned much more in terms of OOP patterns programming, plus TypeScript came out and JavaScript introduced Classes. Wonderful stuff that I now use here, in Jivs.</w:t>
+      </w:r>
+    </w:p>
+    <w:p>
+      <w:r>
+        <w:t xml:space="preserve">Jivs itself is just the </w:t>
+      </w:r>
+      <w:proofErr w:type="gramStart"/>
+      <w:r>
+        <w:t>tooling</w:t>
+      </w:r>
+      <w:proofErr w:type="gramEnd"/>
+      <w:r>
+        <w:t xml:space="preserve"> to evaluate values and return a list of issues found. That is the essence of validation! Jivs is a “service”, doing that job well, and not trying to provide the actual UI. For that, you will be able to add companion libraries to match your environment, such as working in the browser’s DOM or </w:t>
+      </w:r>
       <w:proofErr w:type="spellStart"/>
       <w:r>
-        <w:t>Jivs</w:t>
+        <w:t>React’s</w:t>
       </w:r>
       <w:proofErr w:type="spellEnd"/>
       <w:r>
-        <w:t xml:space="preserve"> - JavaScript Input Validation Service</w:t>
-      </w:r>
-    </w:p>
-    <w:p>
-      <w:r>
-        <w:t xml:space="preserve">Back in the day (2002-2013), I created a successful suite of Web Controls for ASP.NET </w:t>
-      </w:r>
-      <w:proofErr w:type="spellStart"/>
-      <w:r>
-        <w:t>WebForms</w:t>
-      </w:r>
-      <w:proofErr w:type="spellEnd"/>
-      <w:r>
-        <w:t xml:space="preserve"> which featured a complete replacement to its built-in input validation. I really learned a lot about what website developers wanted on</w:t>
-      </w:r>
-      <w:r>
-        <w:t>-</w:t>
-      </w:r>
-      <w:r>
-        <w:t xml:space="preserve">screen. In the 10+ years that followed, I’ve learned much more in terms of OOP patterns programming, plus TypeScript came out and JavaScript introduced Classes. Wonderful stuff that I now use here, in </w:t>
-      </w:r>
-      <w:proofErr w:type="spellStart"/>
-      <w:r>
-        <w:t>Jivs</w:t>
-      </w:r>
-      <w:proofErr w:type="spellEnd"/>
-      <w:r>
-        <w:t>.</w:t>
-      </w:r>
-    </w:p>
-    <w:p>
-      <w:proofErr w:type="spellStart"/>
-      <w:r>
-        <w:t>Jivs</w:t>
-      </w:r>
-      <w:proofErr w:type="spellEnd"/>
-      <w:r>
-        <w:t xml:space="preserve"> itself is just the tooling to evaluate values and return a list of issues found. That is the essence of validation! </w:t>
-      </w:r>
-      <w:proofErr w:type="spellStart"/>
-      <w:r>
-        <w:t>Jivs</w:t>
-      </w:r>
-      <w:proofErr w:type="spellEnd"/>
-      <w:r>
-        <w:t xml:space="preserve"> is a “service”, doing that job well, and not trying to provide the actual UI. For that, you will be able to add companion libraries to match your environment, such as working in the browser’s DOM or </w:t>
-      </w:r>
-      <w:proofErr w:type="spellStart"/>
-      <w:r>
-        <w:t>React’s</w:t>
-      </w:r>
-      <w:proofErr w:type="spellEnd"/>
-      <w:r>
-        <w:t xml:space="preserve"> components. Being a UI-independent service, you can build your own UI around it, and it can run both in the browser and NodeJS.</w:t>
-      </w:r>
-    </w:p>
-    <w:p>
-      <w:proofErr w:type="spellStart"/>
-      <w:r>
-        <w:t>Jivs</w:t>
-      </w:r>
-      <w:proofErr w:type="spellEnd"/>
-      <w:r>
-        <w:t xml:space="preserve"> philosophy involves strong separation of concerns.</w:t>
+        <w:t xml:space="preserve"> components. </w:t>
+      </w:r>
+      <w:proofErr w:type="gramStart"/>
+      <w:r>
+        <w:t>Being a UI-independent service, you</w:t>
+      </w:r>
+      <w:proofErr w:type="gramEnd"/>
+      <w:r>
+        <w:t xml:space="preserve"> can build your own UI around it, and it can run both in the browser and NodeJS.</w:t>
+      </w:r>
+    </w:p>
+    <w:p>
+      <w:r>
+        <w:t>Jivs philosophy involves strong separation of concerns.</w:t>
       </w:r>
     </w:p>
     <w:p>
@@ -87,8 +64,13 @@
         </w:numPr>
       </w:pPr>
       <w:r>
-        <w:t>UI is strongly separated from the validation work</w:t>
-      </w:r>
+        <w:t xml:space="preserve">UI is strongly separated from the validation </w:t>
+      </w:r>
+      <w:proofErr w:type="gramStart"/>
+      <w:r>
+        <w:t>work</w:t>
+      </w:r>
+      <w:proofErr w:type="gramEnd"/>
     </w:p>
     <w:p>
       <w:pPr>
@@ -107,18 +89,26 @@
         <w:t xml:space="preserve">The result is that the UI knows almost nothing about what needs to be validated. The UI just </w:t>
       </w:r>
       <w:r>
-        <w:t xml:space="preserve">posts its current values into </w:t>
-      </w:r>
-      <w:proofErr w:type="spellStart"/>
-      <w:r>
-        <w:t>Jivs</w:t>
-      </w:r>
-      <w:proofErr w:type="spellEnd"/>
-      <w:r>
-        <w:t xml:space="preserve"> and </w:t>
-      </w:r>
-      <w:r>
-        <w:t xml:space="preserve">asks: what are the result of validation? It gets back a Validation Result, such as “Valid”, “Invalid”, or even “Undetermined”, and any issues found. An issue found </w:t>
+        <w:t xml:space="preserve">posts its current values into Jivs and </w:t>
+      </w:r>
+      <w:r>
+        <w:t xml:space="preserve">asks: what </w:t>
+      </w:r>
+      <w:proofErr w:type="gramStart"/>
+      <w:r>
+        <w:t>are</w:t>
+      </w:r>
+      <w:proofErr w:type="gramEnd"/>
+      <w:r>
+        <w:t xml:space="preserve"> the </w:t>
+      </w:r>
+      <w:proofErr w:type="gramStart"/>
+      <w:r>
+        <w:t>result</w:t>
+      </w:r>
+      <w:proofErr w:type="gramEnd"/>
+      <w:r>
+        <w:t xml:space="preserve"> of validation? It gets back a Validation Result, such as “Valid”, “Invalid”, or even “Undetermined”, and any issues found. An issue found </w:t>
       </w:r>
       <w:r>
         <w:t>includes</w:t>
@@ -141,15 +131,7 @@
     </w:p>
     <w:p>
       <w:r>
-        <w:t xml:space="preserve">The UI uses that information to change the visuals: show those errors in some way and perhaps change the appearance of the input and its surroundings. </w:t>
-      </w:r>
-      <w:proofErr w:type="spellStart"/>
-      <w:r>
-        <w:t>Jivs</w:t>
-      </w:r>
-      <w:proofErr w:type="spellEnd"/>
-      <w:r>
-        <w:t xml:space="preserve"> knows nothing about that stuff, although its supporting libraries are well</w:t>
+        <w:t>The UI uses that information to change the visuals: show those errors in some way and perhaps change the appearance of the input and its surroundings. Jivs knows nothing about that stuff, although its supporting libraries are well</w:t>
       </w:r>
       <w:r>
         <w:t>-</w:t>
@@ -171,13 +153,17 @@
           <w:numId w:val="1"/>
         </w:numPr>
       </w:pPr>
-      <w:proofErr w:type="spellStart"/>
-      <w:r>
-        <w:t>ValueHost</w:t>
-      </w:r>
-      <w:proofErr w:type="spellEnd"/>
-      <w:r>
-        <w:t xml:space="preserve"> classes – Identifies a single value can be validated and/or contributes to the rules of your validation. </w:t>
+      <w:r>
+        <w:t xml:space="preserve">ValueHost classes – Identifies a single value </w:t>
+      </w:r>
+      <w:r>
+        <w:t xml:space="preserve">to </w:t>
+      </w:r>
+      <w:r>
+        <w:t xml:space="preserve">be validated and/or contributes to the rules of your validation. </w:t>
+      </w:r>
+      <w:r>
+        <w:t>It has a unique identifier that you use to match it to a specific input, such as the ID of the HTML input tag ("TextBox1"), or even better, a path where it is found in a Model ("Customer/Address/Street").</w:t>
       </w:r>
     </w:p>
     <w:p>
@@ -188,13 +174,19 @@
           <w:numId w:val="1"/>
         </w:numPr>
       </w:pPr>
-      <w:proofErr w:type="spellStart"/>
-      <w:r>
-        <w:t>ValueHost</w:t>
-      </w:r>
-      <w:proofErr w:type="spellEnd"/>
-      <w:r>
-        <w:t xml:space="preserve"> class – For values that are not validated, such as a field from your Model that isn’t editable, or a global value of your app, as both can contribute to your validation logic.</w:t>
+      <w:r>
+        <w:t>ValueHost class – For values that are not validated, such as a field from your Model that isn’t editable, or a global value of your app, as both can contribute to your validation logic.</w:t>
+      </w:r>
+      <w:r>
+        <w:t xml:space="preserve"> Take a postal code as an example. You might use a regular expression to evaluate it. But that expression depends on the country of delivery. </w:t>
+      </w:r>
+      <w:proofErr w:type="gramStart"/>
+      <w:r>
+        <w:t>So</w:t>
+      </w:r>
+      <w:proofErr w:type="gramEnd"/>
+      <w:r>
+        <w:t xml:space="preserve"> you would use a ValueHost to pass in a country code, and let the validation internally select the right expression.</w:t>
       </w:r>
     </w:p>
     <w:p>
@@ -254,13 +246,9 @@
           <w:numId w:val="1"/>
         </w:numPr>
       </w:pPr>
-      <w:proofErr w:type="spellStart"/>
-      <w:r>
-        <w:t>InputValueHost</w:t>
-      </w:r>
-      <w:proofErr w:type="spellEnd"/>
-      <w:r>
-        <w:t xml:space="preserve"> class - </w:t>
+      <w:r>
+        <w:lastRenderedPageBreak/>
+        <w:t xml:space="preserve">InputValueHost class - </w:t>
       </w:r>
       <w:r>
         <w:t xml:space="preserve">Think of these as a UI-independent form of your HTML input fields, just knowing the value of those controls. </w:t>
@@ -275,24 +263,15 @@
         <w:ind w:left="1440"/>
       </w:pPr>
       <w:r>
-        <w:t xml:space="preserve">Some members of this class are (in addition to the inherited from </w:t>
-      </w:r>
+        <w:t>Some members of this class are (in addition to the inherited from ValueHost):</w:t>
+      </w:r>
+    </w:p>
+    <w:p>
+      <w:pPr>
+        <w:pStyle w:val="Code"/>
+      </w:pPr>
       <w:proofErr w:type="spellStart"/>
       <w:r>
-        <w:t>ValueHost</w:t>
-      </w:r>
-      <w:proofErr w:type="spellEnd"/>
-      <w:r>
-        <w:t>):</w:t>
-      </w:r>
-    </w:p>
-    <w:p>
-      <w:pPr>
-        <w:pStyle w:val="Code"/>
-      </w:pPr>
-      <w:proofErr w:type="spellStart"/>
-      <w:r>
-        <w:lastRenderedPageBreak/>
         <w:t>GetWidgetValue</w:t>
       </w:r>
       <w:proofErr w:type="spellEnd"/>
@@ -333,37 +312,21 @@
           <w:numId w:val="1"/>
         </w:numPr>
       </w:pPr>
-      <w:proofErr w:type="spellStart"/>
+      <w:proofErr w:type="gramStart"/>
       <w:r>
         <w:t>ValidationManager</w:t>
       </w:r>
-      <w:proofErr w:type="spellEnd"/>
-      <w:r>
-        <w:t xml:space="preserve"> class – The front-end of this API. Its where you configure the </w:t>
-      </w:r>
-      <w:proofErr w:type="spellStart"/>
-      <w:r>
-        <w:t>ValueHosts</w:t>
-      </w:r>
-      <w:proofErr w:type="spellEnd"/>
-      <w:r>
-        <w:t xml:space="preserve">, get access to a </w:t>
-      </w:r>
-      <w:proofErr w:type="spellStart"/>
-      <w:r>
-        <w:t>ValueHost</w:t>
-      </w:r>
-      <w:proofErr w:type="spellEnd"/>
-      <w:r>
-        <w:t xml:space="preserve">, validate the </w:t>
-      </w:r>
-      <w:proofErr w:type="spellStart"/>
-      <w:r>
-        <w:t>InputValueHosts</w:t>
-      </w:r>
-      <w:proofErr w:type="spellEnd"/>
-      <w:r>
-        <w:t xml:space="preserve"> it contains, and get the validation results.</w:t>
+      <w:proofErr w:type="gramEnd"/>
+      <w:r>
+        <w:t xml:space="preserve"> class – The front-end of this API. </w:t>
+      </w:r>
+      <w:proofErr w:type="gramStart"/>
+      <w:r>
+        <w:t>Its</w:t>
+      </w:r>
+      <w:proofErr w:type="gramEnd"/>
+      <w:r>
+        <w:t xml:space="preserve"> where you configure the ValueHosts, get access to a ValueHost, validate the InputValueHosts it contains, and get the validation results.</w:t>
       </w:r>
     </w:p>
     <w:p>
@@ -431,7 +394,15 @@
         </w:numPr>
       </w:pPr>
       <w:r>
-        <w:t>Condition classes – A class that evaluates value(s) against a rule to see if those values conform. Condition classes exist for each business rule pattern, such as required or compare two values are not identical. While there are many standard rules for which there are Conditions included in this library, you are often going to need to build your own.</w:t>
+        <w:t xml:space="preserve">Condition classes – A class that evaluates value(s) against a rule to see if those values conform. Condition classes exist for each business rule pattern, such as required or </w:t>
+      </w:r>
+      <w:proofErr w:type="gramStart"/>
+      <w:r>
+        <w:t>compare</w:t>
+      </w:r>
+      <w:proofErr w:type="gramEnd"/>
+      <w:r>
+        <w:t xml:space="preserve"> two values are not identical. While there are many standard rules for which there are Conditions included in this library, you are often going to need to build your own.</w:t>
       </w:r>
     </w:p>
     <w:p>
@@ -468,13 +439,8 @@
           <w:numId w:val="1"/>
         </w:numPr>
       </w:pPr>
-      <w:proofErr w:type="spellStart"/>
-      <w:r>
-        <w:t>InputValidator</w:t>
-      </w:r>
-      <w:proofErr w:type="spellEnd"/>
-      <w:r>
-        <w:t xml:space="preserve"> class </w:t>
+      <w:r>
+        <w:t xml:space="preserve">InputValidator class </w:t>
       </w:r>
       <w:r>
         <w:t>–</w:t>
@@ -483,7 +449,15 @@
         <w:t xml:space="preserve"> </w:t>
       </w:r>
       <w:r>
-        <w:t>Handles a single rule, by assigning it to a Condition. So it really doesn’t know how to evaluate. Its job is to handle the validation process and deliver the error messages to the list of issues found.</w:t>
+        <w:t xml:space="preserve">Handles a single rule, by assigning it to a Condition. </w:t>
+      </w:r>
+      <w:proofErr w:type="gramStart"/>
+      <w:r>
+        <w:t>So</w:t>
+      </w:r>
+      <w:proofErr w:type="gramEnd"/>
+      <w:r>
+        <w:t xml:space="preserve"> it really doesn’t know how to evaluate. Its job is to handle the validation process and deliver the error messages to the list of issues found.</w:t>
       </w:r>
     </w:p>
     <w:p>
@@ -491,7 +465,13 @@
         <w:pStyle w:val="ListParagraph"/>
       </w:pPr>
       <w:r>
-        <w:t>Some members of this class is:</w:t>
+        <w:t xml:space="preserve">Some members of this class </w:t>
+      </w:r>
+      <w:r>
+        <w:t>are</w:t>
+      </w:r>
+      <w:r>
+        <w:t>:</w:t>
       </w:r>
     </w:p>
     <w:p>
@@ -521,8 +501,13 @@
         </w:numPr>
       </w:pPr>
       <w:r>
-        <w:t>How to configure, including how to work with your business logic</w:t>
-      </w:r>
+        <w:t xml:space="preserve">How to configure, including how to work with your business </w:t>
+      </w:r>
+      <w:proofErr w:type="gramStart"/>
+      <w:r>
+        <w:t>logic</w:t>
+      </w:r>
+      <w:proofErr w:type="gramEnd"/>
     </w:p>
     <w:p>
       <w:pPr>
@@ -578,6 +563,18 @@
       <w:proofErr w:type="spellEnd"/>
       <w:r>
         <w:t xml:space="preserve"> value)</w:t>
+      </w:r>
+    </w:p>
+    <w:p>
+      <w:pPr>
+        <w:pStyle w:val="ListParagraph"/>
+        <w:numPr>
+          <w:ilvl w:val="0"/>
+          <w:numId w:val="1"/>
+        </w:numPr>
+      </w:pPr>
+      <w:r>
+        <w:t>Relating this to other input validation libraries</w:t>
       </w:r>
     </w:p>
     <w:sectPr>

</xml_diff>

<commit_message>
Replace "Widget" with "Input" for the editable field
GetWidgetValue -> GetInputValue, GetIssuesForWidget -> GetIssuesForInput, etc
</commit_message>
<xml_diff>
--- a/Jivs ReadMe.docx
+++ b/Jivs ReadMe.docx
@@ -272,7 +272,13 @@
       </w:pPr>
       <w:proofErr w:type="spellStart"/>
       <w:r>
-        <w:t>GetWidgetValue</w:t>
+        <w:t>Get</w:t>
+      </w:r>
+      <w:r>
+        <w:t>Input</w:t>
+      </w:r>
+      <w:r>
+        <w:t>Value</w:t>
       </w:r>
       <w:proofErr w:type="spellEnd"/>
     </w:p>
@@ -282,7 +288,13 @@
       </w:pPr>
       <w:proofErr w:type="spellStart"/>
       <w:r>
-        <w:t>SetWidgetValue</w:t>
+        <w:t>Set</w:t>
+      </w:r>
+      <w:r>
+        <w:t>Input</w:t>
+      </w:r>
+      <w:r>
+        <w:t>Value</w:t>
       </w:r>
       <w:proofErr w:type="spellEnd"/>
     </w:p>
@@ -371,7 +383,10 @@
       </w:pPr>
       <w:proofErr w:type="spellStart"/>
       <w:r>
-        <w:t>GetIssuesForWidget</w:t>
+        <w:t>GetIssuesFor</w:t>
+      </w:r>
+      <w:r>
+        <w:t>Input</w:t>
       </w:r>
       <w:proofErr w:type="spellEnd"/>
     </w:p>

</xml_diff>